<commit_message>
Writing an article for Game Makers Energy System
</commit_message>
<xml_diff>
--- a/Articles/2026/2_Game_Maker_2/20_Energy_System/20 Energy System.docx
+++ b/Articles/2026/2_Game_Maker_2/20_Energy_System/20 Energy System.docx
@@ -10,6 +10,67 @@
         <w:t>20 Energy System</w:t>
       </w:r>
     </w:p>
+    <w:p/>
+    <w:p>
+      <w:pPr>
+        <w:jc w:val="center"/>
+      </w:pPr>
+      <w:r>
+        <w:rPr>
+          <w:noProof/>
+        </w:rPr>
+        <w:drawing>
+          <wp:inline distT="0" distB="0" distL="0" distR="0" wp14:anchorId="60C2D61F" wp14:editId="1389DA62">
+            <wp:extent cx="4362450" cy="2895600"/>
+            <wp:effectExtent l="0" t="0" r="0" b="0"/>
+            <wp:docPr id="2078273049" name="Picture 7"/>
+            <wp:cNvGraphicFramePr>
+              <a:graphicFrameLocks xmlns:a="http://schemas.openxmlformats.org/drawingml/2006/main" noChangeAspect="1"/>
+            </wp:cNvGraphicFramePr>
+            <a:graphic xmlns:a="http://schemas.openxmlformats.org/drawingml/2006/main">
+              <a:graphicData uri="http://schemas.openxmlformats.org/drawingml/2006/picture">
+                <pic:pic xmlns:pic="http://schemas.openxmlformats.org/drawingml/2006/picture">
+                  <pic:nvPicPr>
+                    <pic:cNvPr id="0" name="Picture 6"/>
+                    <pic:cNvPicPr>
+                      <a:picLocks noChangeAspect="1" noChangeArrowheads="1"/>
+                    </pic:cNvPicPr>
+                  </pic:nvPicPr>
+                  <pic:blipFill>
+                    <a:blip r:embed="rId5">
+                      <a:extLst>
+                        <a:ext uri="{28A0092B-C50C-407E-A947-70E740481C1C}">
+                          <a14:useLocalDpi xmlns:a14="http://schemas.microsoft.com/office/drawing/2010/main" val="0"/>
+                        </a:ext>
+                      </a:extLst>
+                    </a:blip>
+                    <a:srcRect/>
+                    <a:stretch>
+                      <a:fillRect/>
+                    </a:stretch>
+                  </pic:blipFill>
+                  <pic:spPr bwMode="auto">
+                    <a:xfrm>
+                      <a:off x="0" y="0"/>
+                      <a:ext cx="4362450" cy="2895600"/>
+                    </a:xfrm>
+                    <a:prstGeom prst="rect">
+                      <a:avLst/>
+                    </a:prstGeom>
+                    <a:noFill/>
+                    <a:ln>
+                      <a:noFill/>
+                    </a:ln>
+                  </pic:spPr>
+                </pic:pic>
+              </a:graphicData>
+            </a:graphic>
+          </wp:inline>
+        </w:drawing>
+      </w:r>
+    </w:p>
+    <w:p/>
+    <w:p/>
     <w:p>
       <w:r>
         <w:t xml:space="preserve">In this tutorial, we will be working on the energy system. You may have noticed from the game that we have pick-up items that are apples. These apples are going to be like food for the hero. If he is fighting too long and he </w:t>
@@ -23,6 +84,7 @@
         <w:t xml:space="preserve"> eat some food, he will run out of energy. </w:t>
       </w:r>
     </w:p>
+    <w:p/>
     <w:p>
       <w:r>
         <w:rPr>
@@ -46,7 +108,7 @@
                     </pic:cNvPicPr>
                   </pic:nvPicPr>
                   <pic:blipFill>
-                    <a:blip r:embed="rId5">
+                    <a:blip r:embed="rId6">
                       <a:extLst>
                         <a:ext uri="{28A0092B-C50C-407E-A947-70E740481C1C}">
                           <a14:useLocalDpi xmlns:a14="http://schemas.microsoft.com/office/drawing/2010/main" val="0"/>
@@ -78,9 +140,19 @@
         </w:drawing>
       </w:r>
     </w:p>
-    <w:p>
-      <w:r>
-        <w:t>This is referred to as the energy system, as it will provide energy for the hero. We will be making changes to 4 files to bring this system in.</w:t>
+    <w:p/>
+    <w:p>
+      <w:r>
+        <w:t xml:space="preserve">This is referred to as the </w:t>
+      </w:r>
+      <w:r>
+        <w:rPr>
+          <w:rStyle w:val="Strong"/>
+        </w:rPr>
+        <w:t>energy</w:t>
+      </w:r>
+      <w:r>
+        <w:t xml:space="preserve"> system, as it will provide energy for the hero. We will be making changes to 4 files to bring this system in.</w:t>
       </w:r>
     </w:p>
     <w:p>
@@ -153,6 +225,7 @@
         <w:pStyle w:val="Heading1"/>
       </w:pPr>
       <w:r>
+        <w:lastRenderedPageBreak/>
         <w:t xml:space="preserve">Adding Code to the </w:t>
       </w:r>
       <w:proofErr w:type="spellStart"/>
@@ -163,7 +236,13 @@
     </w:p>
     <w:p>
       <w:r>
-        <w:t xml:space="preserve">Since this file already exists, all we need to go is to go to the </w:t>
+        <w:t>Since this file already exists, all we need to</w:t>
+      </w:r>
+      <w:r>
+        <w:t xml:space="preserve"> do</w:t>
+      </w:r>
+      <w:r>
+        <w:t xml:space="preserve"> is to go to the </w:t>
       </w:r>
       <w:proofErr w:type="spellStart"/>
       <w:r>
@@ -171,7 +250,31 @@
       </w:r>
       <w:proofErr w:type="spellEnd"/>
       <w:r>
-        <w:t xml:space="preserve"> object in the Asset Browser, inside of Game Maker and open the code for it up.</w:t>
+        <w:t xml:space="preserve"> object in the Asset Browser</w:t>
+      </w:r>
+      <w:r>
+        <w:t>. You will find this browser on the right-hand side,</w:t>
+      </w:r>
+      <w:r>
+        <w:t xml:space="preserve"> inside of Game Maker</w:t>
+      </w:r>
+      <w:r>
+        <w:t>,</w:t>
+      </w:r>
+      <w:r>
+        <w:t xml:space="preserve"> </w:t>
+      </w:r>
+      <w:r>
+        <w:t xml:space="preserve">scroll down to find it, and then just </w:t>
+      </w:r>
+      <w:r>
+        <w:t xml:space="preserve">open the code </w:t>
+      </w:r>
+      <w:r>
+        <w:t xml:space="preserve">file </w:t>
+      </w:r>
+      <w:r>
+        <w:t>for it.</w:t>
       </w:r>
     </w:p>
     <w:p>
@@ -195,7 +298,7 @@
                     <pic:cNvPicPr/>
                   </pic:nvPicPr>
                   <pic:blipFill>
-                    <a:blip r:embed="rId6"/>
+                    <a:blip r:embed="rId7"/>
                     <a:stretch>
                       <a:fillRect/>
                     </a:stretch>
@@ -223,9 +326,27 @@
     </w:p>
     <w:p>
       <w:r>
-        <w:t xml:space="preserve">This object only has a Create Event, at this point. So, open the Create Code, and paste this </w:t>
-      </w:r>
-      <w:hyperlink r:id="rId7" w:history="1">
+        <w:t xml:space="preserve">This object only has a </w:t>
+      </w:r>
+      <w:r>
+        <w:rPr>
+          <w:rStyle w:val="Strong"/>
+        </w:rPr>
+        <w:t>Create</w:t>
+      </w:r>
+      <w:r>
+        <w:t xml:space="preserve"> Event, at this point. So, open the </w:t>
+      </w:r>
+      <w:r>
+        <w:rPr>
+          <w:rStyle w:val="Strong"/>
+        </w:rPr>
+        <w:t>Create</w:t>
+      </w:r>
+      <w:r>
+        <w:t xml:space="preserve"> Code, and paste this </w:t>
+      </w:r>
+      <w:hyperlink r:id="rId8" w:history="1">
         <w:r>
           <w:rPr>
             <w:rStyle w:val="Hyperlink"/>
@@ -245,6 +366,9 @@
         <w:t xml:space="preserve"> code </w:t>
       </w:r>
       <w:r>
+        <w:t>in</w:t>
+      </w:r>
+      <w:r>
         <w:t>to it.</w:t>
       </w:r>
     </w:p>
@@ -253,7 +377,6 @@
         <w:rPr>
           <w:noProof/>
         </w:rPr>
-        <w:lastRenderedPageBreak/>
         <w:drawing>
           <wp:inline distT="0" distB="0" distL="0" distR="0" wp14:anchorId="157C738D" wp14:editId="6269AD14">
             <wp:extent cx="4829849" cy="3200847"/>
@@ -270,7 +393,7 @@
                     <pic:cNvPicPr/>
                   </pic:nvPicPr>
                   <pic:blipFill>
-                    <a:blip r:embed="rId8"/>
+                    <a:blip r:embed="rId9"/>
                     <a:stretch>
                       <a:fillRect/>
                     </a:stretch>
@@ -297,6 +420,7 @@
         <w:pStyle w:val="Heading1"/>
       </w:pPr>
       <w:r>
+        <w:lastRenderedPageBreak/>
         <w:t xml:space="preserve">Adding Code to the </w:t>
       </w:r>
       <w:proofErr w:type="spellStart"/>
@@ -326,7 +450,7 @@
                     <pic:cNvPicPr/>
                   </pic:nvPicPr>
                   <pic:blipFill>
-                    <a:blip r:embed="rId9"/>
+                    <a:blip r:embed="rId10"/>
                     <a:stretch>
                       <a:fillRect/>
                     </a:stretch>
@@ -349,16 +473,61 @@
     </w:p>
     <w:p>
       <w:r>
-        <w:t xml:space="preserve">Inside of the Hero object, we will be dealing with both the Create and the Step Event. The only reason, we are going into the Create event is to clean it up. It is really a mess with a huge amount of code that we do not need, and only was using it for testing. We can now just start with one clean line in the Create Event. </w:t>
-      </w:r>
-    </w:p>
-    <w:p>
-      <w:r>
-        <w:t>This next link for the file will show both the Create event shrunk down to just one line, and the changes that were made to the Step event.</w:t>
-      </w:r>
-    </w:p>
-    <w:p>
-      <w:hyperlink r:id="rId10" w:history="1">
+        <w:t>Now we need to make some changes to the hero. So, i</w:t>
+      </w:r>
+      <w:r>
+        <w:t xml:space="preserve">nside of the Hero object, we will be dealing with both the </w:t>
+      </w:r>
+      <w:r>
+        <w:rPr>
+          <w:rStyle w:val="Strong"/>
+        </w:rPr>
+        <w:t>Create</w:t>
+      </w:r>
+      <w:r>
+        <w:t xml:space="preserve"> and the </w:t>
+      </w:r>
+      <w:r>
+        <w:rPr>
+          <w:rStyle w:val="Strong"/>
+        </w:rPr>
+        <w:t>Step</w:t>
+      </w:r>
+      <w:r>
+        <w:t xml:space="preserve"> Event. The only reason, we are going into the Create event is to clean it up. It is really a mess with a huge amount of code that we do not need</w:t>
+      </w:r>
+      <w:r>
+        <w:t>. These massive amount of code lines were only being used</w:t>
+      </w:r>
+      <w:r>
+        <w:t xml:space="preserve"> for testing. We can now just start with one clean line in the Create Event. </w:t>
+      </w:r>
+    </w:p>
+    <w:p>
+      <w:r>
+        <w:t xml:space="preserve">This next link for the file will show both the </w:t>
+      </w:r>
+      <w:r>
+        <w:rPr>
+          <w:rStyle w:val="Strong"/>
+        </w:rPr>
+        <w:t>Create</w:t>
+      </w:r>
+      <w:r>
+        <w:t xml:space="preserve"> event shrunk down to just one line, and the changes that were made to the </w:t>
+      </w:r>
+      <w:r>
+        <w:rPr>
+          <w:rStyle w:val="Strong"/>
+        </w:rPr>
+        <w:t>Step</w:t>
+      </w:r>
+      <w:r>
+        <w:t xml:space="preserve"> event.</w:t>
+      </w:r>
+    </w:p>
+    <w:p>
+      <w:hyperlink r:id="rId11" w:history="1">
         <w:r>
           <w:rPr>
             <w:rStyle w:val="Hyperlink"/>
@@ -371,7 +540,6 @@
     <w:p/>
     <w:p>
       <w:r>
-        <w:lastRenderedPageBreak/>
         <w:t>The Create Event</w:t>
       </w:r>
     </w:p>
@@ -396,7 +564,7 @@
                     <pic:cNvPicPr/>
                   </pic:nvPicPr>
                   <pic:blipFill>
-                    <a:blip r:embed="rId11"/>
+                    <a:blip r:embed="rId12"/>
                     <a:stretch>
                       <a:fillRect/>
                     </a:stretch>
@@ -430,7 +598,7 @@
       <w:r>
         <w:t xml:space="preserve"> Full Code Go </w:t>
       </w:r>
-      <w:hyperlink r:id="rId12" w:history="1">
+      <w:hyperlink r:id="rId13" w:history="1">
         <w:r>
           <w:rPr>
             <w:rStyle w:val="Hyperlink"/>
@@ -449,6 +617,7 @@
         <w:rPr>
           <w:noProof/>
         </w:rPr>
+        <w:lastRenderedPageBreak/>
         <mc:AlternateContent>
           <mc:Choice Requires="wps">
             <w:drawing>
@@ -573,7 +742,7 @@
                     <pic:cNvPicPr/>
                   </pic:nvPicPr>
                   <pic:blipFill>
-                    <a:blip r:embed="rId13"/>
+                    <a:blip r:embed="rId14"/>
                     <a:stretch>
                       <a:fillRect/>
                     </a:stretch>
@@ -637,7 +806,29 @@
           <w:b/>
           <w:bCs/>
         </w:rPr>
-        <w:t xml:space="preserve"> Event here will be staying the same</w:t>
+        <w:t xml:space="preserve"> </w:t>
+      </w:r>
+      <w:r>
+        <w:t>Event here</w:t>
+      </w:r>
+      <w:r>
+        <w:t>,</w:t>
+      </w:r>
+      <w:r>
+        <w:t xml:space="preserve"> will be staying</w:t>
+      </w:r>
+      <w:r>
+        <w:rPr>
+          <w:b/>
+          <w:bCs/>
+        </w:rPr>
+        <w:t xml:space="preserve"> the </w:t>
+      </w:r>
+      <w:r>
+        <w:t>same</w:t>
+      </w:r>
+      <w:r>
+        <w:t>,</w:t>
       </w:r>
       <w:r>
         <w:t xml:space="preserve"> and </w:t>
@@ -661,7 +852,9 @@
     </w:p>
     <w:p>
       <w:r>
-        <w:lastRenderedPageBreak/>
+        <w:rPr>
+          <w:noProof/>
+        </w:rPr>
         <w:drawing>
           <wp:inline distT="0" distB="0" distL="0" distR="0" wp14:anchorId="7D1AC0B4" wp14:editId="065FB34E">
             <wp:extent cx="2781688" cy="1209844"/>
@@ -678,7 +871,7 @@
                     <pic:cNvPicPr/>
                   </pic:nvPicPr>
                   <pic:blipFill>
-                    <a:blip r:embed="rId14"/>
+                    <a:blip r:embed="rId15"/>
                     <a:stretch>
                       <a:fillRect/>
                     </a:stretch>
@@ -701,7 +894,17 @@
     </w:p>
     <w:p>
       <w:r>
-        <w:t>Go Here to see the Code for the DRAW Event</w:t>
+        <w:t xml:space="preserve">Go Here to see the Code for the </w:t>
+      </w:r>
+      <w:r>
+        <w:rPr>
+          <w:b/>
+          <w:bCs/>
+        </w:rPr>
+        <w:t>DRAW</w:t>
+      </w:r>
+      <w:r>
+        <w:t xml:space="preserve"> Event</w:t>
       </w:r>
     </w:p>
     <w:p>
@@ -742,9 +945,13 @@
     </w:p>
     <w:p>
       <w:r>
+        <w:lastRenderedPageBreak/>
         <w:fldChar w:fldCharType="end"/>
       </w:r>
       <w:r>
+        <w:rPr>
+          <w:noProof/>
+        </w:rPr>
         <w:drawing>
           <wp:inline distT="0" distB="0" distL="0" distR="0" wp14:anchorId="0853504B" wp14:editId="0861D7D7">
             <wp:extent cx="5943600" cy="2042160"/>
@@ -761,7 +968,7 @@
                     <pic:cNvPicPr/>
                   </pic:nvPicPr>
                   <pic:blipFill>
-                    <a:blip r:embed="rId15"/>
+                    <a:blip r:embed="rId16"/>
                     <a:stretch>
                       <a:fillRect/>
                     </a:stretch>
@@ -814,7 +1021,25 @@
         </w:tabs>
       </w:pPr>
       <w:r>
-        <w:t>Now remember a script file, is only a file. You do not click on an object or mess with events, when dealing with a SCRIPT file, you only are dealing with a file.</w:t>
+        <w:t xml:space="preserve">Now remember a </w:t>
+      </w:r>
+      <w:r>
+        <w:rPr>
+          <w:rStyle w:val="Strong"/>
+        </w:rPr>
+        <w:t>script</w:t>
+      </w:r>
+      <w:r>
+        <w:t xml:space="preserve"> file, is only a file. You do not click on an object or mess with events, when dealing with a </w:t>
+      </w:r>
+      <w:r>
+        <w:rPr>
+          <w:rStyle w:val="Strong"/>
+        </w:rPr>
+        <w:t>SCRIPT</w:t>
+      </w:r>
+      <w:r>
+        <w:t xml:space="preserve"> file, you only are dealing with a file.</w:t>
       </w:r>
     </w:p>
     <w:p>
@@ -824,6 +1049,9 @@
         </w:tabs>
       </w:pPr>
       <w:r>
+        <w:rPr>
+          <w:noProof/>
+        </w:rPr>
         <w:drawing>
           <wp:inline distT="0" distB="0" distL="0" distR="0" wp14:anchorId="094785DF" wp14:editId="17E76CCB">
             <wp:extent cx="2867425" cy="1390844"/>
@@ -840,7 +1068,7 @@
                     <pic:cNvPicPr/>
                   </pic:nvPicPr>
                   <pic:blipFill>
-                    <a:blip r:embed="rId16"/>
+                    <a:blip r:embed="rId17"/>
                     <a:stretch>
                       <a:fillRect/>
                     </a:stretch>
@@ -870,7 +1098,7 @@
       <w:r>
         <w:t xml:space="preserve">Go </w:t>
       </w:r>
-      <w:hyperlink r:id="rId17" w:history="1">
+      <w:hyperlink r:id="rId18" w:history="1">
         <w:r>
           <w:rPr>
             <w:rStyle w:val="Hyperlink"/>
@@ -889,6 +1117,9 @@
         </w:tabs>
       </w:pPr>
       <w:r>
+        <w:rPr>
+          <w:noProof/>
+        </w:rPr>
         <w:lastRenderedPageBreak/>
         <w:drawing>
           <wp:inline distT="0" distB="0" distL="0" distR="0" wp14:anchorId="07D21DD9" wp14:editId="25E2C10F">
@@ -906,7 +1137,7 @@
                     <pic:cNvPicPr/>
                   </pic:nvPicPr>
                   <pic:blipFill>
-                    <a:blip r:embed="rId18"/>
+                    <a:blip r:embed="rId19"/>
                     <a:stretch>
                       <a:fillRect/>
                     </a:stretch>
@@ -950,6 +1181,37 @@
       </w:pPr>
       <w:r>
         <w:t>Now Start the Game to Test the new energy system</w:t>
+      </w:r>
+      <w:r>
+        <w:t>. You should see your hero running low on energy in the HUD score board, and so he needs to eat up those apples to keep himself going.</w:t>
+      </w:r>
+    </w:p>
+    <w:p>
+      <w:pPr>
+        <w:tabs>
+          <w:tab w:val="left" w:pos="9270"/>
+        </w:tabs>
+      </w:pPr>
+      <w:r>
+        <w:t>And that is all there is to, activating an energy system inside of your own game. I hope you enjoyed this little tutorial that I provided for you this week.</w:t>
+      </w:r>
+    </w:p>
+    <w:p>
+      <w:pPr>
+        <w:tabs>
+          <w:tab w:val="left" w:pos="9270"/>
+        </w:tabs>
+      </w:pPr>
+      <w:r>
+        <w:t xml:space="preserve">Next week, we will be creating a money system where the hero, when he is kicked out of town can spend some of this money, and either rest up at a motel; or at some point, when we get to weapons, he can go to a merchant, and get some </w:t>
+      </w:r>
+      <w:proofErr w:type="gramStart"/>
+      <w:r>
+        <w:t>really cool</w:t>
+      </w:r>
+      <w:proofErr w:type="gramEnd"/>
+      <w:r>
+        <w:t xml:space="preserve"> weapons. This future weapon system will enable our hero to fight some even better, and more powerful monsters.</w:t>
       </w:r>
     </w:p>
     <w:sectPr>

</xml_diff>